<commit_message>
refactor(web): remove Windows app packaging and align documentation
</commit_message>
<xml_diff>
--- a/docs/outputs/07_GenAI_SoftwareDevelopment_user-guide.docx
+++ b/docs/outputs/07_GenAI_SoftwareDevelopment_user-guide.docx
@@ -78,7 +78,7 @@
         <w:jc w:val="both"/>
       </w:pPr>
       <w:r>
-        <w:t>Tài liệu này hướng dẫn thao tác trên giao diện web/PWA và ứng dụng cài đặt Windows. Hai kênh sử dụng cùng một Backend và đều cần kết nối Internet trong phạm vi phát hành hiện tại. Giao diện có thể thay đổi kích thước theo thiết bị nhưng tên chức năng và trình tự nghiệp vụ không thay đổi.</w:t>
+        <w:t xml:space="preserve">Tài liệu này hướng dẫn thao tác trên giao diện web/PWA. Phiên bản web sử dụng Backend FastAPI và cần kết nối Internet trong phạm vi phát hành hiện tại. Giao diện có thể thay đổi kích thước theo thiết bị nhưng tên chức năng và trình tự nghiệp vụ không thay đổi.</w:t>
       </w:r>
     </w:p>
     <w:tbl>
@@ -499,7 +499,7 @@
         <w:jc w:val="both"/>
       </w:pPr>
       <w:r>
-        <w:t>Đối với người dùng cuối, thiết bị chỉ cần đủ khả năng chạy trình duyệt hiện đại hoặc ứng dụng Windows. Cấu hình tham chiếu theo SRS:</w:t>
+        <w:t xml:space="preserve">Đối với người dùng cuối, thiết bị chỉ cần đủ khả năng chạy trình duyệt hiện đại. Cấu hình tham chiếu theo SRS:</w:t>
       </w:r>
     </w:p>
     <w:p>
@@ -592,7 +592,7 @@
       </w:r>
       <w:r>
         <w:tab/>
-        <w:t>Hoặc ứng dụng Windows được nhóm phát triển cung cấp. Người dùng không cần cài Python, Git, VS Code hay hệ quản trị cơ sở dữ liệu.</w:t>
+        <w:t xml:space="preserve">Người dùng không cần cài Python, Git, VS Code hay hệ quản trị cơ sở dữ liệu.</w:t>
       </w:r>
     </w:p>
     <w:p>

</xml_diff>